<commit_message>
Fix wrong dust-collection cover photo -- was live on production, not just the draft
images/garage-tips/dust-collection-cover.jpg (the real cover_image_path for
the published "Dust Collection Setup" article, per sql/garage-tips-covers.sql)
was an unrelated architectural staircase/railing photo, not dust collection
equipment at all. Served directly from images/ (no Storage upload involved,
see kerphGarageTipImageUrl), so this was live and wrong on the actual site,
not just in the Articles/ draft copy that reused it.

Replaced with a real, on-topic photo (a shop vacuum with hose, wood board
visible) -- same Pexels License terms as the other two existing covers.
Verified the other two existing covers (table saw, tool maintenance) are
correct; only this one was wrong.

Regenerated Articles/18-dust-collection-setup/article.docx with the fixed
cover embedded.

Co-Authored-By: Claude Sonnet 5 <noreply@anthropic.com>
</commit_message>
<xml_diff>
--- a/Articles/18-dust-collection-setup/article.docx
+++ b/Articles/18-dust-collection-setup/article.docx
@@ -34,7 +34,7 @@
       <w:r>
         <w:drawing>
           <wp:inline distT="0" distB="0" distL="0" distR="0">
-            <wp:extent cx="5486400" cy="8261604"/>
+            <wp:extent cx="5486400" cy="8229600"/>
             <wp:docPr id="1" name="Cover"/>
             <wp:cNvGraphicFramePr>
               <a:graphicFrameLocks noChangeAspect="1"/>
@@ -55,7 +55,7 @@
                   <pic:spPr>
                     <a:xfrm>
                       <a:off x="0" y="0"/>
-                      <a:ext cx="5486400" cy="8261604"/>
+                      <a:ext cx="5486400" cy="8229600"/>
                     </a:xfrm>
                     <a:prstGeom prst="rect">
                       <a:avLst/>

</xml_diff>